<commit_message>
Decision log: capture today's conceptual decisions with reasoning
Backfills the conceptual decisions that lived mostly in conversation:
the regulatory-burden primitive + unit rule + scope (definitional core,
pointing to rubric §1); the private/public statutory-source test (FSCS
public despite levy; contracted-out firms private; levy duties still count);
the enabling-power rule that dissolves the Cat-3 IB split; and the newer
validation/labelling strategy + the models/rules/review design principle.

Co-Authored-By: Claude Opus 4.8 (1M context) <noreply@anthropic.com>
</commit_message>
<xml_diff>
--- a/project_decision_log.docx
+++ b/project_decision_log.docx
@@ -338,6 +338,130 @@
         <w:t>Newest at top.</w:t>
       </w:r>
     </w:p>
+    <w:tbl>
+      <w:tblPr>
+        <w:tblW w:type="auto" w:w="0"/>
+        <w:tblLook w:firstColumn="1" w:firstRow="1" w:lastColumn="0" w:lastRow="0" w:noHBand="0" w:noVBand="1" w:val="04A0"/>
+      </w:tblPr>
+      <w:tblGrid>
+        <w:gridCol w:w="9360"/>
+      </w:tblGrid>
+      <w:tr>
+        <w:tc>
+          <w:tcPr>
+            <w:tcW w:type="dxa" w:w="9360"/>
+          </w:tcPr>
+          <w:p>
+            <w:r>
+              <w:t>The regulatory-burden primitive, the unit rule, and scope (definitional core)</w:t>
+            </w:r>
+          </w:p>
+          <w:p>
+            <w:r>
+              <w:t>Decision — the primitive: a regulatory burden is one legally-binding requirement imposed on a private actor, defined ONCE; both polarities (an obligation to act, a prohibition from acting) are inherited from that single primitive rather than defined as separate things. Polarity is therefore an attribute, not a category. Reasoning: one primitive keeps the measure coherent and additive, and lets obligation/prohibition be recorded without fracturing the taxonomy.</w:t>
+            </w:r>
+          </w:p>
+          <w:p>
+            <w:r>
+              <w:t>Unit of count: the distinct obligation, not the sentence — enumerated leaves that are genuinely distinct duties count each; a list of conditions/factors attached to a single duty counts once. Scope is broad (all private actors, including individuals in personal capacity) with an economic/personal capacity axis tagged conservatively (ambiguous used generously; the ambiguous pile deferred to phase 2/3). Count, not magnitude: an unweighted count of distinct obligations — a stated methodological limitation (RegData-style), not an omission. These three are fully stated in the rubric (§1); logged here as pointers so the definitional core is discoverable from the log.</w:t>
+            </w:r>
+          </w:p>
+        </w:tc>
+      </w:tr>
+    </w:tbl>
+    <w:tbl>
+      <w:tblPr>
+        <w:tblW w:type="auto" w:w="0"/>
+        <w:tblLook w:firstColumn="1" w:firstRow="1" w:lastColumn="0" w:lastRow="0" w:noHBand="0" w:noVBand="1" w:val="04A0"/>
+      </w:tblPr>
+      <w:tblGrid>
+        <w:gridCol w:w="9360"/>
+      </w:tblGrid>
+      <w:tr>
+        <w:tc>
+          <w:tcPr>
+            <w:tcW w:type="dxa" w:w="9360"/>
+          </w:tcPr>
+          <w:p>
+            <w:r>
+              <w:t>Private/public partition via the statutory-source test</w:t>
+            </w:r>
+          </w:p>
+          <w:p>
+            <w:r>
+              <w:t>Decision: a body is public (its obligations excluded) if it is statutorily created, exercises a public/regulatory function, and is accountable to a public regulator — regardless of how it is funded. Worked calls, from the reasoning that lived in conversation: the FSCS and the Financial Ombudsman Service are PUBLIC despite being levy-funded (funding source does not privatise a statutory regulator); a contracted-out firm performing public functions is PRIVATE (the burden falls on a non-state entity); a levy DUTY imposed on firms still COUNTS as a private-actor burden (the duty lands on the firm, even though the levy funds a public body).</w:t>
+            </w:r>
+          </w:p>
+          <w:p>
+            <w:r>
+              <w:t>Reasoning: the source/status of the body — not its funding, nor who ultimately benefits — determines the partition. This stops levy-funded regulators being miscounted as private and keeps genuine duties on firms in scope. Fully stated in the rubric (§5D function test + hybrid-actor note); this entry records the reasoning and the three worked calls.</w:t>
+            </w:r>
+          </w:p>
+        </w:tc>
+      </w:tr>
+    </w:tbl>
+    <w:tbl>
+      <w:tblPr>
+        <w:tblW w:type="auto" w:w="0"/>
+        <w:tblLook w:firstColumn="1" w:firstRow="1" w:lastColumn="0" w:lastRow="0" w:noHBand="0" w:noVBand="1" w:val="04A0"/>
+      </w:tblPr>
+      <w:tblGrid>
+        <w:gridCol w:w="9360"/>
+      </w:tblGrid>
+      <w:tr>
+        <w:tc>
+          <w:tcPr>
+            <w:tcW w:type="dxa" w:w="9360"/>
+          </w:tcPr>
+          <w:p>
+            <w:r>
+              <w:t>Enabling-power rule dissolves the IB split</w:t>
+            </w:r>
+          </w:p>
+          <w:p>
+            <w:r>
+              <w:t>Decision: count a burden where the Act ITSELF imposes it. A bare power to make secondary legislation is NOT counted — the burden, if any, arrives with the regulations and is counted there. Compliance/contravention hooks (“contravenes section 4”, offence-for-breach cross-references) are NOT counted; they are counted at the primary provision they point to (count-at-source).</w:t>
+            </w:r>
+          </w:p>
+          <w:p>
+            <w:r>
+              <w:t>Consequence: this resolves the rubric’s §7 open item — the Category-3 (Implied burden) dual-rationale split DISSOLVES. Enabling/reg-making powers are no longer routed to IB, so IB reverts to only the defence-revealed case. Reasoning: prevents double-counting the same burden at both the enabling Act and the resulting SI (both are in-corpus), and removes the incoherent two-concepts-under-one-label training risk for Cat 3. Supersedes rubric §5C/§7 — to fold into the next rubric revision.</w:t>
+            </w:r>
+          </w:p>
+        </w:tc>
+      </w:tr>
+    </w:tbl>
+    <w:tbl>
+      <w:tblPr>
+        <w:tblW w:type="auto" w:w="0"/>
+        <w:tblLook w:firstColumn="1" w:firstRow="1" w:lastColumn="0" w:lastRow="0" w:noHBand="0" w:noVBand="1" w:val="04A0"/>
+      </w:tblPr>
+      <w:tblGrid>
+        <w:gridCol w:w="9360"/>
+      </w:tblGrid>
+      <w:tr>
+        <w:tc>
+          <w:tcPr>
+            <w:tcW w:type="dxa" w:w="9360"/>
+          </w:tcPr>
+          <w:p>
+            <w:r>
+              <w:t>Validation &amp; labelling strategy, and the layered design principle</w:t>
+            </w:r>
+          </w:p>
+          <w:p>
+            <w:r>
+              <w:t>Decisions (newer strategy, not yet in the rubric): (1) Era-stratified validation + era-spread labelling — training and validation samples are spread across drafting eras (Victorian through modern) so the classifier is not tuned to one drafting style. (2) Rare-class handling is retrieval-first — actively retrieve real examples of rare categories; anchored-synthetic examples are a flagged LAST RESORT only, and NEVER placed in validation sets (validation must be real). (3) Whole-pipeline design principle: models for language patterns, deterministic rules for facts and structure, human review for the residue.</w:t>
+            </w:r>
+          </w:p>
+          <w:p>
+            <w:r>
+              <w:t>Reasoning: era-spread controls drafting-style bias (the corpus spans centuries); retrieval-first keeps rare-class training honest and keeps validation trustworthy (synthetic data never scores the measure); the models/rules/review split puts each judgement where it is most reliable and auditable — the linguistic call to the model, facts/structure to deterministic rules, and only the genuine residue to human review.</w:t>
+            </w:r>
+          </w:p>
+        </w:tc>
+      </w:tr>
+    </w:tbl>
     <w:tbl>
       <w:tblPr>
         <w:tblW w:type="auto" w:w="0"/>

</xml_diff>

<commit_message>
Decision log: TNA cross-check is corpus validation, not analytical
Records the two-leg validation framing: (a) corpus validity checked
externally via the TNA dataset cross-check + direct TNA correspondence;
(b) analytical validity internal by design (dual-model, human adjudication,
held-out real-only validation, periodic full-Act human classification).
No external gold standard exists for the burden measure itself; TNA is not
to be described as validating the analysis anywhere.

Co-Authored-By: Claude Opus 4.8 (1M context) <noreply@anthropic.com>
</commit_message>
<xml_diff>
--- a/project_decision_log.docx
+++ b/project_decision_log.docx
@@ -338,6 +338,47 @@
         <w:t>Newest at top.</w:t>
       </w:r>
     </w:p>
+    <w:tbl>
+      <w:tblPr>
+        <w:tblW w:type="auto" w:w="0"/>
+        <w:tblLook w:firstColumn="1" w:firstRow="1" w:lastColumn="0" w:lastRow="0" w:noHBand="0" w:noVBand="1" w:val="04A0"/>
+      </w:tblPr>
+      <w:tblGrid>
+        <w:gridCol w:w="9360"/>
+      </w:tblGrid>
+      <w:tr>
+        <w:tc>
+          <w:tcPr>
+            <w:tcW w:type="dxa" w:w="9360"/>
+          </w:tcPr>
+          <w:p>
+            <w:r>
+              <w:t>TNA cross-check is corpus validation (Layer 0/1), not analytical validation</w:t>
+            </w:r>
+          </w:p>
+          <w:p>
+            <w:r>
+              <w:t>Decision: the TNA Statutory Powers and Duties Dataset cross-check sits at Layer 0/1 as CORPUS validation — not at Layer 5, and not as external validation of the analysis. The validation story has two distinct legs. (a) Corpus validity — checked externally: against the TNA dataset (the cross-check subsystem) and via direct TNA correspondence on in-force definitions and identifier schemes. (b) Analytical validity — internal by design: dual-model independent labelling, human adjudication, held-out real-only validation, and periodic full-Act independent human classification.</w:t>
+            </w:r>
+          </w:p>
+          <w:p>
+            <w:r>
+              <w:t>State plainly in any write-up: no external gold standard exists for the burden measure itself — it is the first of its kind — which is why the internal machinery and full methodological transparency carry the analytical-validity leg. TNA must NOT be described as validating the analysis anywhere.</w:t>
+            </w:r>
+          </w:p>
+          <w:p>
+            <w:r>
+              <w:t>Reasoning: TNA is a section-level duty/power dataset over the same legislation, so it can corroborate what provisions exist (a corpus check) but it does not distinguish private from public actors and is structurally blind to non-operative-modality errors — so it cannot validate the burden classification. Keeping the two legs separate prevents overclaiming an external validation the measure does not have. (Revises the earlier open framing question — where the TNA cross-check sits in the layered architecture — for whenever the layered-architecture doc is written.)</w:t>
+            </w:r>
+          </w:p>
+          <w:p>
+            <w:r>
+              <w:t>Pattern: #3 (Named ≠ actual) — a cross-check that looks like analytical validation is not; name the leg it actually supports.</w:t>
+            </w:r>
+          </w:p>
+        </w:tc>
+      </w:tr>
+    </w:tbl>
     <w:tbl>
       <w:tblPr>
         <w:tblW w:type="auto" w:w="0"/>

</xml_diff>

<commit_message>
Decision log + gap-list follow-ups: amendment-flag bug, provenance calibration
- Decision log: new recurring pattern "one rule, multiple textual homes";
  entry for is_amendment_insertion firing 0/1,084 (pattern #3 named≠actual,
  sibling of section_ref JOIN KEY); entry calibrating amendment-provenance
  100% as test-set-only, corpus-wide TBC.
- Gap list + diagrams: G3 / N2 / L2c corrected to DECIDED-UNBUILT (§3 rule
  ratified, executor unbuilt, existing flag broken).
- Notes + implementation plan: provenance calibration wording; queued the
  corpus-wide spot-check and the pre-stage-2 flag fix/rename.

No push.

Co-Authored-By: Claude Opus 4.8 (1M context) <noreply@anthropic.com>
</commit_message>
<xml_diff>
--- a/project_decision_log.docx
+++ b/project_decision_log.docx
@@ -255,6 +255,14 @@
         <w:t>A vivid example tempts over-generalisation. Having caught a real issue, measure its true scale against actual data before investing in a fix — the same example that reveals a bug can mislead you about how widespread it is.</w:t>
       </w:r>
     </w:p>
+    <w:p>
+      <w:pPr>
+        <w:pStyle w:val="ListParagraph"/>
+      </w:pPr>
+      <w:r>
+        <w:t>One rule, multiple textual homes. A single substantive rule can be written down in more than one place, so the same burden risks being counted twice or zero times depending which home the labeller lands on. Seen three times: IB double-meaning (defence vs primary prohibition) → enabling-power / SI compliance-hook double-count → amendment double-count (amending instruction vs consolidated target). A consolidated-plus-amending corpus makes this the project's characteristic failure surface; reach for count-at-source, and recognise the next instance by shape.</w:t>
+      </w:r>
+    </w:p>
     <w:tbl>
       <w:tblPr>
         <w:tblW w:w="9360" w:type="dxa"/>
@@ -338,6 +346,98 @@
         <w:t>Newest at top.</w:t>
       </w:r>
     </w:p>
+    <w:tbl>
+      <w:tblPr>
+        <w:tblW w:type="auto" w:w="0"/>
+        <w:tblLook w:firstColumn="1" w:firstRow="1" w:lastColumn="0" w:lastRow="0" w:noHBand="0" w:noVBand="1" w:val="04A0"/>
+      </w:tblPr>
+      <w:tblGrid>
+        <w:gridCol w:w="9360"/>
+      </w:tblGrid>
+      <w:tr>
+        <w:tc>
+          <w:tcPr>
+            <w:tcW w:type="dxa" w:w="9360"/>
+          </w:tcPr>
+          <w:p>
+            <w:r>
+              <w:t>is_amendment_insertion fires 0/1,084 — a live field promising amendment detection that detects nothing</w:t>
+            </w:r>
+          </w:p>
+          <w:p>
+            <w:r>
+              <w:t>What: extract_candidates.py sets is_amendment_insertion via _in_amendment(), which tests find_parent(['Addition','ins','InF']) — it fires only when a whole section/Text node NESTS INSIDE an &lt;Addition&gt;. Real amendments are inline fragment insertions (the &lt;Addition&gt; sits inside the Text, not the reverse), so the flag fired on 0 of 1,084 candidate records across the 7-Act set despite 16,366 &lt;Addition&gt; nodes present (1,403 of them burden-bearing). The field name promises amendment-insertion detection; it delivers none.</w:t>
+            </w:r>
+          </w:p>
+          <w:p>
+            <w:r>
+              <w:t>What prompted the catch: the 2026-07-05 amendment-provenance measurement (pricing introduced_by/introduced_year) counted Additions directly, found provenance ~100% recoverable, then cross-checked the record flag and found it flat zero.</w:t>
+            </w:r>
+          </w:p>
+          <w:p>
+            <w:r>
+              <w:t>Why it matters now (raised stakes): the ratified §3 amendment-machinery rule (amendment = machinery, count at the consolidated target) NEEDS a working amendment detector, and this flag is the one field anyone would reach for. It also mis-grains provenance — 22.4% of amendment-touched sections carry &gt;1 amending instrument — so detection/attribution must be at the &lt;Addition&gt;-fragment grain, not the section flag.</w:t>
+            </w:r>
+          </w:p>
+          <w:p>
+            <w:r>
+              <w:t>Resolution: logged as a bug, not fixed. No code change now. Before Stage 2 the field is either fixed (re-implemented at the &lt;Addition&gt;-fragment grain) or renamed/removed so nothing builds on a false signal. Tracked in docs/decision_tree_gaps.md (G3) as DECIDED-UNBUILT.</w:t>
+            </w:r>
+          </w:p>
+          <w:p>
+            <w:r>
+              <w:t>Pattern: #3 (Named ≠ actual) — a live field named for a capability it does not have. Direct sibling of the section_ref 'unambiguous JOIN KEY' entry: both are locally-plausible identifiers/flags in extract_candidates.py that silently fail their advertised contract.</w:t>
+            </w:r>
+          </w:p>
+        </w:tc>
+      </w:tr>
+    </w:tbl>
+    <w:tbl>
+      <w:tblPr>
+        <w:tblW w:type="auto" w:w="0"/>
+        <w:tblLook w:firstColumn="1" w:firstRow="1" w:lastColumn="0" w:lastRow="0" w:noHBand="0" w:noVBand="1" w:val="04A0"/>
+      </w:tblPr>
+      <w:tblGrid>
+        <w:gridCol w:w="9360"/>
+      </w:tblGrid>
+      <w:tr>
+        <w:tc>
+          <w:tcPr>
+            <w:tcW w:type="dxa" w:w="9360"/>
+          </w:tcPr>
+          <w:p>
+            <w:r>
+              <w:t>Amendment-provenance 100% is a test-set figure — corpus-wide coverage unconfirmed</w:t>
+            </w:r>
+          </w:p>
+          <w:p>
+            <w:r>
+              <w:t>What: the 2026-07-05 measurement found introduced_by/introduced_year machine-recoverable for 1,403/1,403 burden-bearing &lt;Addition&gt; fragments and 2,374/2,374 Type-F textual-amendment commentaries — 100%. That is on the 7 verification Acts, which lean modern and CLML-clean.</w:t>
+            </w:r>
+          </w:p>
+          <w:p>
+            <w:r>
+              <w:t>Calibration: pre-digital-era consolidations are where amendment annotation (the &lt;Commentary&gt;/&lt;Citation&gt; machinery provenance rides on) is thinnest, so corpus-wide coverage would plausibly sag below 100%. The 7-Act figure must not be reported as a corpus-wide rate.</w:t>
+            </w:r>
+          </w:p>
+          <w:p>
+            <w:r>
+              <w:t>Methodology claim until confirmed: 'amendment provenance verified recoverable on the test set; corpus-wide coverage TBC.'</w:t>
+            </w:r>
+          </w:p>
+          <w:p>
+            <w:r>
+              <w:t>Resolution / queued: a spot-check of amendment-provenance recoverability on OLDER CONSOLIDATIONS is QUEUED, not run. introduced_by/introduced_year stay nullable so labelling never stalls; the growth-over-time claim is hedged to the test set until the spot-check lands.</w:t>
+            </w:r>
+          </w:p>
+          <w:p>
+            <w:r>
+              <w:t>Pattern: #2 (Sample ≠ systematic) / #4 (the headline glosses a remainder) — a 100% on a modern, clean sample glosses the older-consolidation tail where it would degrade.</w:t>
+            </w:r>
+          </w:p>
+        </w:tc>
+      </w:tr>
+    </w:tbl>
     <w:tbl>
       <w:tblPr>
         <w:tblW w:type="auto" w:w="0"/>

</xml_diff>

<commit_message>
Docs: record tier-3 anchor (G29 DECIDED-BUILT; baseline + certification hook)
implementation_plan: tier-3 DONE note (four counters unchanged, new-type counts alongside) + taxonomy-completeness certification hook. decision_tree_gaps: G29 DECIDED-BUILT + G25 orphan-lane residue note. decision log: taxonomy 5->8 entry + severity correction. These files also carry earlier uncommitted ripples (frontier-proxy schema note, G15 capacity-axis reshape, v2.5/v2.6 decision entries), banked here as they are inseparable in-file.

Co-Authored-By: Claude Opus 4.8 (1M context) <noreply@anthropic.com>
</commit_message>
<xml_diff>
--- a/project_decision_log.docx
+++ b/project_decision_log.docx
@@ -344,6 +344,60 @@
           <w:iCs/>
         </w:rPr>
         <w:t>Newest at top.</w:t>
+      </w:r>
+    </w:p>
+    <w:p>
+      <w:pPr/>
+      <w:r>
+        <w:t>2026-07-16 — Layer-1 taxonomy extended 5 → 8 material_types (ratified; tier-3 anchor BUILT &amp; VERIFIED). The item-8 old-drafting orphan fix (design note `_layer1_orphan_investigation.md` §C) is implemented. A third anchor tier catches schedule/annex prose-and-list content and bare-&lt;P&gt; body tail-clauses that tiers 1-2 drop to orphan, routing them into THREE NEW material_types: uk_schedule_unnumbered, eu_annex, uk_body_tail. Option (ii) chosen (new types, NOT re-baselining the four counters): the documented 727/862/106/611 are PROVABLY UNTOUCHED (verified old-vs-new on identical XML), and eu_annex is separately queryable for the REUL-facing analysis. Grain rule: per-entry (enumerated lists) / whole-form (statutory forms) / paragraph-block (prose). Verification (all four passed): baseline reproduces exactly (+44 uk_schedule_unnumbered, +2 uk_body_tail, orphans 2→0 on the 7-Act set; Explosives uk_body stays 51); round-3 pool 36 orphans → 0 re-homed (20-sentence→19 uk_schedule_unnumbered, 16-sentence→10 eu_annex); specimen refs match drafter numbering (MSA 5th-schedule para (1)-(9); eur/1169 annex headings); sizes sane (no mega/dust). NB numbered EU-annex content stays uk_schedule (tiers 1-2 frozen) — eu_annex is tier-3 EU-annex content only. Gap G29 closed DECIDED-BUILT; orphan-lane (G25) + anomalous-rate trigger remain for the residue; certification hook queued (size distributions per leg_type × material_type).</w:t>
+      </w:r>
+    </w:p>
+    <w:p>
+      <w:pPr/>
+      <w:r>
+        <w:t>SEVERITY CORRECTION on the record (this defect): the original problem was CONTEXT-QUALITY plus a lost subtree-cushion (orphans emitted per-sentence, no ref/heading, ungrouped), NOT lost recall — the flat fallback was already emitting every cue-bearing orphan sentence as a candidate. So this was a grouping/context-quality fix, not a recall recovery. Pattern: verify the premise before building on it (#9) — proving the four-counter invariant by running old-vs-new on identical XML, rather than trusting 'untouched by construction'.</w:t>
+      </w:r>
+    </w:p>
+    <w:p>
+      <w:pPr/>
+      <w:r>
+        <w:t>2026-07-15 — Capacity axis REDEFINED (constitutive; Jethro's). The economic/personal capacity tag now turns on whether the duty attaches to VOLUNTARY MARKET ACTIVITY on the burdened actor's side (exchange or production-for-exchange), either side, formal or informal — SUPERSEDING the activity-profile formulation. Side-specific COMPULSION carve-out: a scheme-compelled transaction (dog-chip fee, MOT, compulsory insurance) does not confer economic capacity on the compelled party (classify by the underlying activity → personal); the provider side is their trade → economic. Rationale: captures the informal economy (private / C2C sellers) without a trader/private-seller line, and the compulsion carve-out prevents state-compelled purchases inflating the economic count. Economic floor restated to include consumer-side transactors, with a business-side cut as its own line. Folded into rubric v2.6 §1; scope anchor + gaps.md G15 reshaped. Pattern: verify the premise before building on it (#9) — the eBay-seller and compelled-purchase edge cases forced the redefinition before the floor figure is trusted.</w:t>
+      </w:r>
+    </w:p>
+    <w:p>
+      <w:pPr/>
+      <w:r>
+        <w:t>2026-07-15 — Finding A: two constitutive rulings (Jethro's), from round 3. (1) Deeming distinction — interpretive deeming (labels for a scheme's purposes) stays excluded; substance-creating deeming (statutory implied/deemed contract terms) is a burden, re-attributed (CRA 2015 s.13 → 1 trader burden vs Commission Decision 2000/532 → 0). (2) Statutory private-law duties count, both sides — obligations with legal force count regardless of regulatory-vs-private-law statute, trader-vs-consumer side, mandatory-vs-displaceable-default (CRA s.25 consumer pay-at-contract-rate → 1, Cat 2, obligation, consumer, economic). Methodology disclosure: the measure counts statutory obligations as defined, not a pre-sorted 'regulation' subset. Folded into rubric v2.6 §4/§1. Pattern: one rule, multiple textual homes (#10) — the implied contract term is the same burden whether written as a deemed term or a direct duty; count it once, at the substance-creating provision.</w:t>
+      </w:r>
+    </w:p>
+    <w:p>
+      <w:pPr/>
+      <w:r>
+        <w:t>2026-07-15 — Rubric round 3 (stability gate against v2.5): 25 sections, 5 eras, 21 fresh instruments; 23/25 exact-or-within-range, one blocking finding (Finding A) resolved into v2.6. Regressions passed: chain-ordering (Factories s.110); amendment/N2 (HSWA Sch 1, fee payload); frontier four flavours (fired ML reg 74A; silent PHA 1875 s.183 / PHA 1936 byelaw-making; in-measure contrast FHW Sch); 'powers or duties' at FSMA s.333T; IBA consistency TDA s.24 = Wildlife s.14. Era prediction FALSIFIED — mid-century clean; both divergences from CRA 2015. Full record: _test_round_3_results.md; extraction Layer-1 findings: _test_round_3_extraction_findings.md (orphan anomaly under investigation, item 8). Pattern: sample ≠ systematic (#6) — the era-stratified prediction (old drafting = hard) was wrong; the hard cases were modern private-law.</w:t>
+      </w:r>
+    </w:p>
+    <w:p>
+      <w:pPr/>
+      <w:r>
+        <w:t>2026-07-14 — Deepest-visible-layer principle (frontier proxies). Scope Q&amp;A on byelaws and out-of-corpus instruments — NOT a trace failure — generalised the v2.4 non-legislative-target rule into a scope-conditional principle: count each burden once, at the deepest layer the measure can see. An in-measure compliance/contravention hook stays excluded (counted at its target); a statutory duty to comply with an out-of-measure binding instrument — permit/licence/notice, byelaw, regulator rulebook (FCA/PRA Handbooks the heavyweight) — is counted once as a frontier proxy for the invisible layer behind it. Counts are not additive across scope expansions: if scope later widens to an out-of-measure layer, its proxies re-classify to counted_at_source. Folded into rubric v2.5 §3, with schema tags frontier_hook / frontier_target_type (§2A + implementation plan); scope disclosure and the FSMA-2023 layer-migration growth caveat added to the coverage/scope methodology note; project_scope_anchor.md created.</w:t>
+      </w:r>
+    </w:p>
+    <w:p>
+      <w:pPr/>
+      <w:r>
+        <w:t>Pattern: “One rule, multiple textual homes” (#10) — count-at-source extended across the measure’s scope boundary. The frontier proxy is the count-at-source answer when the deeper home is invisible; the re-classification-on-expansion rule stops the same rule being counted in two scopes at once.</w:t>
+      </w:r>
+    </w:p>
+    <w:p>
+      <w:pPr/>
+      <w:r>
+        <w:t>2026-07-14 — Rubric dry-run round 2 (stability test): clean, 10/10. Ten fresh cold sections (_test_round_2_sections.md) drawn from unused sections of the seven extracted Acts (no Acts outside the seven are extracted; reserved set untouched). Mechanical = holistic 10/10, zero blockers. Regressions passed: Finding-1 single-act-vs-independent-constraint on reg 21(5); three-step permission/exemption on GDPR Art 9 (the (2)(d) straddler correctly routed to ambiguous-leaf review); amendment-machinery rule’s first live pass on ERA Sch 60 (Railways Act 1993 consequential amendments); Apple eudn state-addressee → zero private-actor burdens (public-body gate). Stopping rule stands: round 2 clean → v2.5 is the sign-off read target.</w:t>
+      </w:r>
+    </w:p>
+    <w:p>
+      <w:pPr/>
+      <w:r>
+        <w:t>Ripple flagged: reg 38(3) (round-1 dry-run set) pending cross-section resolution vs reg 36/37 under chain-ordering — annotated in _dryrun_sections.md. Pattern: “Sample ≠ systematic” (#6) — a clean round is reassurance, not proof; the reg 38(3) cross-section item is exactly the remainder to pull on.</w:t>
       </w:r>
     </w:p>
     <w:tbl>

</xml_diff>

<commit_message>
Layer-1 taxonomy semantics v2: types describe content, not anchoring history
eu_annex now means annex content in any EU-family instrument at every anchor tier (was: tier-3-rescued annex content only). Schedule-mapped content in eur/eudn re-types uk_schedule -> eu_annex whichever tier anchored it; pre-check confirmed all EU-family Schedule content is annex (no protocols/appendices). Typing-only: anchoring/grain/boundaries/refs/headings byte-identical (verified old-vs-new, 0 non-type diffs; ref/heading re-keyed on anchor tier, not the type label). Re-baseline (signed off): documented reference is now the eight-type 7-Act set uk_body 727 / uk_schedule 842 / eu_article 106 / eu_recital 611 / uk_schedule_unnumbered 44 / eu_annex 20 / uk_body_tail 2; old four-type 727/862/106/611 retained as superseded historical baseline.

Co-Authored-By: Claude Opus 4.8 (1M context) <noreply@anthropic.com>
</commit_message>
<xml_diff>
--- a/project_decision_log.docx
+++ b/project_decision_log.docx
@@ -344,6 +344,18 @@
           <w:iCs/>
         </w:rPr>
         <w:t>Newest at top.</w:t>
+      </w:r>
+    </w:p>
+    <w:p>
+      <w:pPr/>
+      <w:r>
+        <w:t>2026-07-16 — Taxonomy semantics v2: material_type describes CONTENT, not anchoring history (ratified; re-baseline signed off). Re-typing pass on the eight-type taxonomy — eu_annex now means annex content in an EU-family instrument, FULL STOP, at every anchor tier, superseding the interim 'annex content that used to orphan' (a label defined by extractor history = named-≠-actual waiting to bite a future analyst). Sole delta: Schedule-mapped content in eur/eudn re-types uk_schedule → eu_annex whichever tier anchored it. Pre-check confirmed ALL EU-family Schedule content is annex (GDPR ANNEX 1/2, eur/1169 ANNEX I-17, eudn/532 ANNEX; no protocols/appendices), so the flip is unambiguous. Typing-only: anchoring / grain / boundaries / refs / headings byte-identical (verified old-vs-new — 0 non-type diffs; ref/heading re-keyed on the anchor TIER, not the type label, so re-typing tiers-1/2 annex content leaves its refs untouched). Rationale: eu_annex must be trustable at face value for the REUL-facing analysis. Committed SEPARATELY from the tier-3 fix (two auditable steps: verified-fix then semantic-migration).</w:t>
+      </w:r>
+    </w:p>
+    <w:p>
+      <w:pPr/>
+      <w:r>
+        <w:t>RE-BASELINE — signed off (Jethro). The documented reference becomes the EIGHT-type 7-Act count set — uk_body 727 / uk_schedule 842 / eu_article 106 / eu_recital 611 / uk_schedule_unnumbered 44 / eu_annex 20 / uk_body_tail 2 (total 2,352 sections, unchanged) — SUPERSEDING 727/862/106/611 (retained as the historical four-type baseline); uk_schedule moved 862 → 842 as its 20 EU-annex sections re-typed. Recorded in implementation_plan.md with the old four preserved as superseded. Pattern: named ≠ actual (#7) — a type defined by extractor history rather than content is exactly the trap the pattern names; fixed before bulk extraction locks thousands of records to the misnomer.</w:t>
       </w:r>
     </w:p>
     <w:p>

</xml_diff>

<commit_message>
Exclusion taxonomy v2: structural promoted to family; amendment_machinery -> counted_at_source subclass
Ratified 2026-07-20. structural (operative-but-not-a-burden) is a distinct joint
from binds-no-one (public_body_or_no_one); amendment_machinery folds under
counted_at_source (count-at-consolidated-target). Families now:
non_operative / counted_at_source / public_body_or_no_one / structural.

- implementation_plan.md: family enum updated.
- decision_tree_gaps.md G2: families + sub-classes (structural enumerated).
- label_store_format_note.md: exclusion sub-class table added.
- project_decision_log.docx: entry added (newest at top).

Co-Authored-By: Claude Opus 4.8 (1M context) <noreply@anthropic.com>
</commit_message>
<xml_diff>
--- a/project_decision_log.docx
+++ b/project_decision_log.docx
@@ -344,6 +344,18 @@
           <w:iCs/>
         </w:rPr>
         <w:t>Newest at top.</w:t>
+      </w:r>
+    </w:p>
+    <w:p>
+      <w:pPr/>
+      <w:r>
+        <w:t>2026-07-20 — Exclusion taxonomy v2 (ratified; Jethro’s). structural promoted to a load-bearing exclusion family — operative-but-not-a-burden is a distinct joint from binds-no-one (public_body_or_no_one); the former amendment_machinery family folds into counted_at_source as a sub-class (the rule is count-at-consolidated-target). Families now: non_operative / counted_at_source / public_body_or_no_one / structural. Updated implementation_plan.md, decision_tree_gaps.md G2, and docs/label_store_format_note.md (structural sub-classes enumerated: bare_permission / scope_eligibility / condition_factor_list / single_act_specification / procedural_right_v_state / liability_attribution / burden_removal).</w:t>
+      </w:r>
+    </w:p>
+    <w:p>
+      <w:pPr/>
+      <w:r>
+        <w:t>Pattern: “Named ≠ actual” (#3) — the original 4-family set (amendment_machinery as a family; structural items scattered under non_operative) diverged from the ratified design and surfaced only when the label-store build cross-checked the format-note families against the schema. Caught at build time and ratified consciously, not silently reverted.</w:t>
       </w:r>
     </w:p>
     <w:p>

</xml_diff>

<commit_message>
Rubric v1.1 (pilot adjudication) + format-note shape reconciliation
- validation_rubric.md -> v1.1: six additions (constituted-duties; specifications-vs-
  embedded-duties; IB boundary + named-target/source_target incl. defence-provision routing;
  compliant-actor test; polarity conventions; capacity note). No previously-traced counts change.
- label_store_format_note.md: identity reconciled to the flat as-built shape (top-level
  id/title/section_ref/section_index/section_key); rubric_version stamp -> v1.1; source_target added.
- rubric_revision_notes.md: v1.1 published + format-note reconciliation logged.
- project_decision_log.docx: pilot-adjudication session entry (bin tallies + sequence integrity).
- .gitignore: keep _campaign_spec.md local.

Co-Authored-By: Claude Opus 4.8 (1M context) <noreply@anthropic.com>
</commit_message>
<xml_diff>
--- a/project_decision_log.docx
+++ b/project_decision_log.docx
@@ -344,6 +344,18 @@
           <w:iCs/>
         </w:rPr>
         <w:t>Newest at top.</w:t>
+      </w:r>
+    </w:p>
+    <w:p>
+      <w:pPr/>
+      <w:r>
+        <w:t>2026-07-21 — Pilot adjudication session complete (reserved 15-section set; rubric ratified to v1.1). Gold written: 27 burdens across 15 sections; 9 adjudication records. Bin tally: 1 rubric-text gap (EPR reg 36 — constituted duties at a power provision; Jethro right, both models 0), ~6 margin-calls now converted to worked examples (Explosives s.32; burials Sch 2 para 7; GDPR Art 13 &amp; Art 32; ERA s.27BA &amp; s.98; LRSA s.23 — fold/unit fine-splitting), 1 labeller-discipline finding (Gemini: no review_reason, non-enum values, no leaf anchors -&gt; prompt-contract + ingest-validation item), 0 genuinely-ambiguous residents. Rubric v1.1 folds six additions (constituted-duties; specifications-vs-embedded-duties; IB-boundary + named-target/source_target; compliant-actor test; polarity conventions; capacity note) — no previously-traced counts change. Both/either wager: one major cluster (GDPR) fell to Jethro’s side; the set stays economic-heavy, unresolved pending the calibration batch.</w:t>
+      </w:r>
+    </w:p>
+    <w:p>
+      <w:pPr/>
+      <w:r>
+        <w:t>Pattern: “Named ≠ actual” + named-target verification (process credit to Jethro) — verifying s.94’s actual words (“An employee has the right not to be unfairly dismissed”) resolved ERA s.98 to zero-here / counted-at-s.94, catching an IB mis-read. Sequence integrity: Jethro’s per-section summary was posted PRE-reveal; transcription happened post-reveal, performed mechanically; the provenance file (labels_jethro_provenance.md) governs, and post-reveal revisions live in adjudication.jsonl, never back in the human leg.</w:t>
       </w:r>
     </w:p>
     <w:p>

</xml_diff>